<commit_message>
docs(pricing): correct the explainer — Sonnet 5 rates, measured voice cost, current shipping status
The Sonnet examples were priced at Sonnet 4.6 ($3/$15); production runs
Sonnet 5 ($2/$10), so every Sonnet figure was 50% high (reply 2.1→1.4
credits, summary 6.3→4.2, Starter covers 357 Sonnet replies not 238). Voice
now uses $0.18/min measured on three real calls (83 minutes on Pro's 3,000
credits, not 100) and notes that the shipped Pro voice is a separate flat
100-minute meter. "Live billing is unchanged" → plans are live, credits are
not. Same corrections in the .docx explainer.

Co-Authored-By: Claude Fable 5.1 <noreply@anthropic.com>
Claude-Session: https://claude.ai/code/session_019ihsbr6zgp1M79NaG1ez5y
</commit_message>
<xml_diff>
--- a/docs/NUDGE_PRICING_EXPLAINED_UPDATED.docx
+++ b/docs/NUDGE_PRICING_EXPLAINED_UPDATED.docx
@@ -12,7 +12,7 @@
     </w:p>
     <w:p>
       <w:r>
-        <w:t>India and Singapore • Pricing decision guide • 11 September 2026</w:t>
+        <w:t>India and Singapore • Pricing decision guide • 11 September 2026, figures revised 15 September 2026</w:t>
       </w:r>
     </w:p>
     <w:p>
@@ -22,7 +22,7 @@
     </w:p>
     <w:p>
       <w:r>
-        <w:t>Updated pricing: permanent Entry plan ₹1,499/month; Starter ₹4,499/month. Growth and Pro are unchanged. Credit allowances and top-up prices remain proposals. Live billing is unchanged.</w:t>
+        <w:t>Updated pricing: permanent Entry plan ₹1,499/month; Starter ₹4,499/month. Growth and Pro are unchanged. Credit allowances and top-up prices remain proposals. The plan ladder, seats and numbers are live on the site and in checkout since 12 September; credits, top-ups and any annual discount are not built.</w:t>
       </w:r>
     </w:p>
     <w:p>
@@ -2374,7 +2374,7 @@
                 <w:b w:val="0"/>
                 <w:sz w:val="20"/>
               </w:rPr>
-              <w:t>Same-size Sonnet reply</w:t>
+              <w:t>Same-size Sonnet 5 reply</w:t>
             </w:r>
           </w:p>
         </w:tc>
@@ -2406,7 +2406,7 @@
                 <w:b w:val="0"/>
                 <w:sz w:val="20"/>
               </w:rPr>
-              <w:t>2.1</w:t>
+              <w:t>1.4</w:t>
             </w:r>
           </w:p>
         </w:tc>
@@ -2438,7 +2438,7 @@
                 <w:b w:val="0"/>
                 <w:sz w:val="20"/>
               </w:rPr>
-              <w:t>₹0.945</w:t>
+              <w:t>₹0.630</w:t>
             </w:r>
           </w:p>
         </w:tc>
@@ -2470,7 +2470,7 @@
                 <w:b w:val="0"/>
                 <w:sz w:val="20"/>
               </w:rPr>
-              <w:t>₹2.098</w:t>
+              <w:t>₹1.399</w:t>
             </w:r>
           </w:p>
         </w:tc>
@@ -2506,7 +2506,7 @@
                 <w:b w:val="0"/>
                 <w:sz w:val="20"/>
               </w:rPr>
-              <w:t>Longer Sonnet summary</w:t>
+              <w:t>Longer Sonnet 5 summary</w:t>
             </w:r>
           </w:p>
         </w:tc>
@@ -2538,7 +2538,7 @@
                 <w:b w:val="0"/>
                 <w:sz w:val="20"/>
               </w:rPr>
-              <w:t>6.3</w:t>
+              <w:t>4.2</w:t>
             </w:r>
           </w:p>
         </w:tc>
@@ -2570,7 +2570,7 @@
                 <w:b w:val="0"/>
                 <w:sz w:val="20"/>
               </w:rPr>
-              <w:t>₹2.835</w:t>
+              <w:t>₹1.890</w:t>
             </w:r>
           </w:p>
         </w:tc>
@@ -2602,7 +2602,7 @@
                 <w:b w:val="0"/>
                 <w:sz w:val="20"/>
               </w:rPr>
-              <w:t>₹6.294</w:t>
+              <w:t>₹4.196</w:t>
             </w:r>
           </w:p>
         </w:tc>
@@ -2638,7 +2638,7 @@
                 <w:b w:val="0"/>
                 <w:sz w:val="20"/>
               </w:rPr>
-              <w:t>One voice minute at assumed cost</w:t>
+              <w:t>One voice minute at measured cost</w:t>
             </w:r>
           </w:p>
         </w:tc>
@@ -2670,7 +2670,7 @@
                 <w:b w:val="0"/>
                 <w:sz w:val="20"/>
               </w:rPr>
-              <w:t>30</w:t>
+              <w:t>36</w:t>
             </w:r>
           </w:p>
         </w:tc>
@@ -2702,7 +2702,7 @@
                 <w:b w:val="0"/>
                 <w:sz w:val="20"/>
               </w:rPr>
-              <w:t>₹13.50</w:t>
+              <w:t>₹16.20</w:t>
             </w:r>
           </w:p>
         </w:tc>
@@ -2734,7 +2734,7 @@
                 <w:b w:val="0"/>
                 <w:sz w:val="20"/>
               </w:rPr>
-              <w:t>₹29.97</w:t>
+              <w:t>₹35.96</w:t>
             </w:r>
           </w:p>
         </w:tc>
@@ -2996,7 +2996,7 @@
                 <w:b w:val="0"/>
                 <w:sz w:val="20"/>
               </w:rPr>
-              <w:t>Same-size Sonnet reply</w:t>
+              <w:t>Same-size Sonnet 5 reply</w:t>
             </w:r>
           </w:p>
         </w:tc>
@@ -3028,7 +3028,7 @@
                 <w:b w:val="0"/>
                 <w:sz w:val="20"/>
               </w:rPr>
-              <w:t>S$0.01418</w:t>
+              <w:t>S$0.00945</w:t>
             </w:r>
           </w:p>
         </w:tc>
@@ -3060,7 +3060,7 @@
                 <w:b w:val="0"/>
                 <w:sz w:val="20"/>
               </w:rPr>
-              <w:t>S$0.0399</w:t>
+              <w:t>S$0.0266</w:t>
             </w:r>
           </w:p>
         </w:tc>
@@ -3096,7 +3096,7 @@
                 <w:b w:val="0"/>
                 <w:sz w:val="20"/>
               </w:rPr>
-              <w:t>Longer Sonnet summary</w:t>
+              <w:t>Longer Sonnet 5 summary</w:t>
             </w:r>
           </w:p>
         </w:tc>
@@ -3128,7 +3128,7 @@
                 <w:b w:val="0"/>
                 <w:sz w:val="20"/>
               </w:rPr>
-              <w:t>S$0.04253</w:t>
+              <w:t>S$0.02835</w:t>
             </w:r>
           </w:p>
         </w:tc>
@@ -3160,7 +3160,7 @@
                 <w:b w:val="0"/>
                 <w:sz w:val="20"/>
               </w:rPr>
-              <w:t>S$0.1197</w:t>
+              <w:t>S$0.0798</w:t>
             </w:r>
           </w:p>
         </w:tc>
@@ -3196,7 +3196,7 @@
                 <w:b w:val="0"/>
                 <w:sz w:val="20"/>
               </w:rPr>
-              <w:t>One voice minute at assumed cost</w:t>
+              <w:t>One voice minute at measured cost</w:t>
             </w:r>
           </w:p>
         </w:tc>
@@ -3228,7 +3228,7 @@
                 <w:b w:val="0"/>
                 <w:sz w:val="20"/>
               </w:rPr>
-              <w:t>S$0.2025</w:t>
+              <w:t>S$0.2430</w:t>
             </w:r>
           </w:p>
         </w:tc>
@@ -3260,7 +3260,7 @@
                 <w:b w:val="0"/>
                 <w:sz w:val="20"/>
               </w:rPr>
-              <w:t>S$0.5700</w:t>
+              <w:t>S$0.6840</w:t>
             </w:r>
           </w:p>
         </w:tc>
@@ -3287,7 +3287,7 @@
     </w:p>
     <w:p>
       <w:r>
-        <w:t>The calculations use published Haiku 4.5 rates of US$1 input and US$5 output per million tokens, and Sonnet 4.6 rates of US$3 and US$15. They do not change which model Nudge runs. Cache usage and extra calls change the total. Source: Anthropic pricing, checked 11 September 2026.</w:t>
+        <w:t>The calculations use published Haiku 4.5 rates of US$1 input and US$5 output per million tokens, and Sonnet 5 rates of US$2 and US$10, the model Nudge runs in production (an earlier draft used Sonnet 4.6 at US$3 and US$15, 50% too high). They do not change which model Nudge runs. Cache usage and extra calls change the total. Source: Anthropic pricing, checked 11 September 2026.</w:t>
       </w:r>
     </w:p>
     <w:p>
@@ -3300,7 +3300,7 @@
     </w:p>
     <w:p>
       <w:r>
-        <w:t>The voice example assumes US$0.15 per minute all-in; it is not a carrier quote. It must cover speech, AI and the selected phone route without counting the same AI cost twice. At that cost, Pro’s 3,000 credits cover 100 voice minutes if used for nothing else. At US$0.25 per minute, they cover only 60 minutes.</w:t>
+        <w:t>The voice example uses US$0.18 per minute all-in, measured on three real test calls on 11 September 2026 (ElevenLabs about US$0.145, Claude Haiku US$0.021, phone line about US$0.01); it is still not a carrier quote. It must cover speech, AI and the selected phone route without counting the same AI cost twice. At that cost, Pro’s 3,000 credits cover 83 voice minutes if used for nothing else. At US$0.25 per minute, they cover only 60 minutes. Until the shared wallet ships, Pro’s voice is a separate 100-minute meter costing about ₹1,620 (S$24) a month at full use, on top of the chat credits.</w:t>
       </w:r>
     </w:p>
     <w:p>
@@ -4466,7 +4466,7 @@
     </w:p>
     <w:p>
       <w:r>
-        <w:t>The biggest practical risk is spending hours setting up a low-price customer. Another risk is an allowance too small for ordinary use: 500 credits cover roughly 714 example Haiku replies but only 238 example Sonnet replies. Real customer conversations must decide whether that feels fair.</w:t>
+        <w:t>The biggest practical risk is spending hours setting up a low-price customer. Another risk is an allowance too small for ordinary use: 500 credits cover roughly 714 example Haiku replies but only 357 example Sonnet replies. Real customer conversations must decide whether that feels fair.</w:t>
       </w:r>
     </w:p>
     <w:p>
@@ -5898,7 +5898,7 @@
     </w:p>
     <w:p>
       <w:r>
-        <w:t>Before live charges, build reliable wallet accounting, spending caps and payment reconciliation; exclude simulation from real charges. Agree how existing customers move to the new plans. Product code and billing remain unchanged by this document.</w:t>
+        <w:t>Before live charges, build reliable wallet accounting, spending caps and payment reconciliation; exclude simulation from real charges. Agree how existing customers move to the new plans. This document does not itself change code: the tiered plans are live, the credit wallet and top-ups are not, and the site offers no annual discount.</w:t>
       </w:r>
     </w:p>
     <w:p>

</xml_diff>

<commit_message>
docs(billing): credit-ledger build plan; correct Sonnet rate in the record
The pricing record priced Sonnet at 4.6's $3/$15; the runtime default is
claude-sonnet-5 at $2/$10. Every Sonnet credit example, the included-
credit reply counts and the 100-leads/day enterprise example are recomputed
on the real rate (a third lower). Note that usage.ts analytics still
overstate Sonnet 5 cost by 50% until the exact rate card ships.

Add docs/superpowers/plans/2026-09-15-credit-ledger.md: nine TDD tasks
(~35h) — exact-model rate card, CreditGrant/CreditDebit ledger debited at
the model-router doorway with FOR UPDATE serialisation, calendar-month
resets, top-up purchase via the existing Razorpay/Stripe flow, founder
grants, balance UI, reconciler. Six founder decisions listed; not started.

Co-Authored-By: Claude Opus 5 (1M context) <noreply@anthropic.com>
(cherry picked from commit 9e92c316c56495b6c46cb37e2f51d4c5c0b8e06f)
</commit_message>
<xml_diff>
--- a/docs/NUDGE_PRICING_EXPLAINED_UPDATED.docx
+++ b/docs/NUDGE_PRICING_EXPLAINED_UPDATED.docx
@@ -1539,16 +1539,56 @@
         <w:t xml:space="preserve"> </w:t>
       </w:r>
       <w:r>
-        <w:t xml:space="preserve">checked 2026-09-15 — Haiku 4.5 US$1 in / US$5 out per million tokens; Sonnet</w:t>
-      </w:r>
-      <w:r>
-        <w:t xml:space="preserve"> </w:t>
-      </w:r>
-      <w:r>
-        <w:t xml:space="preserve">5 (the production</w:t>
-      </w:r>
-      <w:r>
-        <w:t xml:space="preserve"> </w:t>
+        <w:t xml:space="preserve">checked 2026-09-15 against Anthropic’s price sheet — Haiku 4.5 US$1 in / US$5</w:t>
+      </w:r>
+      <w:r>
+        <w:t xml:space="preserve"> </w:t>
+      </w:r>
+      <w:r>
+        <w:t xml:space="preserve">out per million tokens;</w:t>
+      </w:r>
+      <w:r>
+        <w:t xml:space="preserve"> </w:t>
+      </w:r>
+      <w:r>
+        <w:rPr>
+          <w:b/>
+          <w:bCs/>
+        </w:rPr>
+        <w:t xml:space="preserve">Sonnet 5 US$2 / US$10</w:t>
+      </w:r>
+      <w:r>
+        <w:t xml:space="preserve"> </w:t>
+      </w:r>
+      <w:r>
+        <w:t xml:space="preserve">(cache reads ≈ 0.1× and cache</w:t>
+      </w:r>
+      <w:r>
+        <w:t xml:space="preserve"> </w:t>
+      </w:r>
+      <w:r>
+        <w:t xml:space="preserve">writes ≈ 1.25× the input rate). Nudge runs</w:t>
+      </w:r>
+      <w:r>
+        <w:t xml:space="preserve"> </w:t>
+      </w:r>
+      <w:r>
+        <w:rPr>
+          <w:rStyle w:val="VerbatimChar"/>
+        </w:rPr>
+        <w:t xml:space="preserve">claude-sonnet-5</w:t>
+      </w:r>
+      <w:r>
+        <w:t xml:space="preserve"> </w:t>
+      </w:r>
+      <w:r>
+        <w:t xml:space="preserve">at runtime</w:t>
+      </w:r>
+      <w:r>
+        <w:t xml:space="preserve"> </w:t>
+      </w:r>
+      <w:r>
+        <w:t xml:space="preserve">(</w:t>
       </w:r>
       <w:r>
         <w:rPr>
@@ -1557,13 +1597,22 @@
         <w:t xml:space="preserve">RUNTIME_MODEL</w:t>
       </w:r>
       <w:r>
-        <w:t xml:space="preserve">) US$2 / US$10. An earlier draft used Sonnet</w:t>
-      </w:r>
-      <w:r>
-        <w:t xml:space="preserve"> </w:t>
-      </w:r>
-      <w:r>
-        <w:t xml:space="preserve">4.6 rates and overstated those example costs by 50%. One credit still costs us</w:t>
+        <w:t xml:space="preserve"> </w:t>
+      </w:r>
+      <w:r>
+        <w:t xml:space="preserve">default, since 2026-08-29). The 2026-09-11 version of this</w:t>
+      </w:r>
+      <w:r>
+        <w:t xml:space="preserve"> </w:t>
+      </w:r>
+      <w:r>
+        <w:t xml:space="preserve">record priced everything at Sonnet 4.6’s US$3 / US$15 — a third too high;</w:t>
+      </w:r>
+      <w:r>
+        <w:t xml:space="preserve"> </w:t>
+      </w:r>
+      <w:r>
+        <w:t xml:space="preserve">every Sonnet figure below is now on the Sonnet 5 rate. One credit costs us</w:t>
       </w:r>
       <w:r>
         <w:t xml:space="preserve"> </w:t>
@@ -1576,7 +1625,10 @@
         <w:t xml:space="preserve">₹0.45 / S$0.00675</w:t>
       </w:r>
       <w:r>
-        <w:t xml:space="preserve">.</w:t>
+        <w:t xml:space="preserve"> </w:t>
+      </w:r>
+      <w:r>
+        <w:t xml:space="preserve">regardless of model.</w:t>
       </w:r>
     </w:p>
     <w:bookmarkStart w:id="24" w:name="Xc8d942be20b51320dd6252afea3de7af1ea1b60"/>
@@ -1808,56 +1860,56 @@
               <w:pStyle w:val="Compact"/>
             </w:pPr>
             <w:r>
-              <w:t xml:space="preserve">One voice minute (measured about US$0.18 all-in)</w:t>
-            </w:r>
-          </w:p>
-        </w:tc>
-        <w:tc>
-          <w:tcPr/>
-          <w:p>
-            <w:pPr>
-              <w:pStyle w:val="Compact"/>
-              <w:jc w:val="right"/>
-            </w:pPr>
-            <w:r>
-              <w:t xml:space="preserve">36</w:t>
-            </w:r>
-          </w:p>
-        </w:tc>
-        <w:tc>
-          <w:tcPr/>
-          <w:p>
-            <w:pPr>
-              <w:pStyle w:val="Compact"/>
-              <w:jc w:val="right"/>
-            </w:pPr>
-            <w:r>
-              <w:t xml:space="preserve">₹16.20</w:t>
-            </w:r>
-          </w:p>
-        </w:tc>
-        <w:tc>
-          <w:tcPr/>
-          <w:p>
-            <w:pPr>
-              <w:pStyle w:val="Compact"/>
-              <w:jc w:val="right"/>
-            </w:pPr>
-            <w:r>
-              <w:t xml:space="preserve">₹35.96</w:t>
+              <w:t xml:space="preserve">One voice minute (assumed US$0.15 all-in)</w:t>
+            </w:r>
+          </w:p>
+        </w:tc>
+        <w:tc>
+          <w:tcPr/>
+          <w:p>
+            <w:pPr>
+              <w:pStyle w:val="Compact"/>
+              <w:jc w:val="right"/>
+            </w:pPr>
+            <w:r>
+              <w:t xml:space="preserve">30</w:t>
+            </w:r>
+          </w:p>
+        </w:tc>
+        <w:tc>
+          <w:tcPr/>
+          <w:p>
+            <w:pPr>
+              <w:pStyle w:val="Compact"/>
+              <w:jc w:val="right"/>
+            </w:pPr>
+            <w:r>
+              <w:t xml:space="preserve">₹13.50</w:t>
+            </w:r>
+          </w:p>
+        </w:tc>
+        <w:tc>
+          <w:tcPr/>
+          <w:p>
+            <w:pPr>
+              <w:pStyle w:val="Compact"/>
+              <w:jc w:val="right"/>
+            </w:pPr>
+            <w:r>
+              <w:t xml:space="preserve">₹29.97</w:t>
             </w:r>
           </w:p>
         </w:tc>
       </w:tr>
     </w:tbl>
     <w:bookmarkEnd w:id="24"/>
-    <w:bookmarkStart w:id="25" w:name="X4e6c3b4e81bce9bb20edd01e280bbaf99a98b72"/>
+    <w:bookmarkStart w:id="25" w:name="X46395848078524a131e8fc4a0e77c75062e5ca5"/>
     <w:p>
       <w:pPr>
         <w:pStyle w:val="Heading3"/>
       </w:pPr>
       <w:r>
-        <w:t xml:space="preserve">How far the included credits go (Sonnet, example reply size)</w:t>
+        <w:t xml:space="preserve">How far the included credits go (Sonnet 5, example reply size)</w:t>
       </w:r>
     </w:p>
     <w:tbl>
@@ -1954,7 +2006,7 @@
               <w:jc w:val="right"/>
             </w:pPr>
             <w:r>
-              <w:t xml:space="preserve">142</w:t>
+              <w:t xml:space="preserve">143</w:t>
             </w:r>
           </w:p>
         </w:tc>
@@ -1978,7 +2030,7 @@
               <w:jc w:val="right"/>
             </w:pPr>
             <w:r>
-              <w:t xml:space="preserve">1,785</w:t>
+              <w:t xml:space="preserve">1,786</w:t>
             </w:r>
           </w:p>
         </w:tc>
@@ -3224,52 +3276,31 @@
         <w:pStyle w:val="BodyText"/>
       </w:pPr>
       <w:r>
-        <w:t xml:space="preserve">Voice is about US$0.18/minute all-in based on three real test calls: roughly</w:t>
-      </w:r>
-      <w:r>
-        <w:t xml:space="preserve"> </w:t>
-      </w:r>
-      <w:r>
-        <w:t xml:space="preserve">US$0.145 ElevenLabs, US$0.021 Haiku and US$0.01 for the line, still not a final</w:t>
-      </w:r>
-      <w:r>
-        <w:t xml:space="preserve"> </w:t>
-      </w:r>
-      <w:r>
-        <w:t xml:space="preserve">carrier quote. At that cost, 5,000 credits would buy about 138 minutes if used</w:t>
-      </w:r>
-      <w:r>
-        <w:t xml:space="preserve"> </w:t>
-      </w:r>
-      <w:r>
-        <w:t xml:space="preserve">for nothing else. Until the shared credit ledger ships, Pro voice is instead a</w:t>
-      </w:r>
-      <w:r>
-        <w:t xml:space="preserve"> </w:t>
-      </w:r>
-      <w:r>
-        <w:t xml:space="preserve">separate flat 100-minute meter (</w:t>
-      </w:r>
-      <w:r>
-        <w:rPr>
-          <w:rStyle w:val="VerbatimChar"/>
-        </w:rPr>
-        <w:t xml:space="preserve">voiceMinutesPerMonth</w:t>
-      </w:r>
-      <w:r>
-        <w:t xml:space="preserve">) on top of chat credits,</w:t>
-      </w:r>
-      <w:r>
-        <w:t xml:space="preserve"> </w:t>
-      </w:r>
-      <w:r>
-        <w:t xml:space="preserve">costing about ₹1,620 / S$24 at full use. Never advertise both the full chat</w:t>
-      </w:r>
-      <w:r>
-        <w:t xml:space="preserve"> </w:t>
-      </w:r>
-      <w:r>
-        <w:t xml:space="preserve">allowance and full voice allowance as simultaneously included.</w:t>
+        <w:t xml:space="preserve">Voice draws on the same credit balance. At the assumed US$0.15/minute, Pro’s 5,000</w:t>
+      </w:r>
+      <w:r>
+        <w:t xml:space="preserve"> </w:t>
+      </w:r>
+      <w:r>
+        <w:t xml:space="preserve">credits buy about 166 voice minutes if used for nothing else (at US$0.25, 100</w:t>
+      </w:r>
+      <w:r>
+        <w:t xml:space="preserve"> </w:t>
+      </w:r>
+      <w:r>
+        <w:t xml:space="preserve">minutes). Never advertise the full chat allowance and the full voice allowance</w:t>
+      </w:r>
+      <w:r>
+        <w:t xml:space="preserve"> </w:t>
+      </w:r>
+      <w:r>
+        <w:t xml:space="preserve">as simultaneously included. The voice figure is an assumption, not a carrier</w:t>
+      </w:r>
+      <w:r>
+        <w:t xml:space="preserve"> </w:t>
+      </w:r>
+      <w:r>
+        <w:t xml:space="preserve">quote; verify speech, inference and carrier costs before selling live voice.</w:t>
       </w:r>
     </w:p>
     <w:bookmarkEnd w:id="27"/>
@@ -3342,7 +3373,7 @@
           <w:b/>
           <w:bCs/>
         </w:rPr>
-        <w:t xml:space="preserve">credits ≈ ₹15,120 of AI cost a month on Sonnet 5</w:t>
+        <w:t xml:space="preserve">credits ≈ ₹15,100 of AI cost a month on Sonnet 5</w:t>
       </w:r>
       <w:r>
         <w:t xml:space="preserve"> </w:t>
@@ -3354,7 +3385,13 @@
         <w:t xml:space="preserve"> </w:t>
       </w:r>
       <w:r>
-        <w:t xml:space="preserve">5,000 included credits cover less than a sixth; at list price Nudge loses money.</w:t>
+        <w:t xml:space="preserve">5,000 included credits cover about a seventh of it; at list price ₹4,900 is</w:t>
+      </w:r>
+      <w:r>
+        <w:t xml:space="preserve"> </w:t>
+      </w:r>
+      <w:r>
+        <w:t xml:space="preserve">left before hosting, support or anything else — not a deal to sell at list.</w:t>
       </w:r>
     </w:p>
     <w:p>
@@ -3447,43 +3484,43 @@
               <w:pStyle w:val="Compact"/>
             </w:pPr>
             <w:r>
-              <w:t xml:space="preserve">A. Committed credit block — Pro + 50,000 credits/month at ₹0.75</w:t>
-            </w:r>
-          </w:p>
-        </w:tc>
-        <w:tc>
-          <w:tcPr/>
-          <w:p>
-            <w:pPr>
-              <w:pStyle w:val="Compact"/>
-              <w:jc w:val="right"/>
-            </w:pPr>
-            <w:r>
-              <w:t xml:space="preserve">≈ ₹57,500</w:t>
-            </w:r>
-          </w:p>
-        </w:tc>
-        <w:tc>
-          <w:tcPr/>
-          <w:p>
-            <w:pPr>
-              <w:pStyle w:val="Compact"/>
-              <w:jc w:val="right"/>
-            </w:pPr>
-            <w:r>
-              <w:t xml:space="preserve">≈ ₹15,120</w:t>
-            </w:r>
-          </w:p>
-        </w:tc>
-        <w:tc>
-          <w:tcPr/>
-          <w:p>
-            <w:pPr>
-              <w:pStyle w:val="Compact"/>
-              <w:jc w:val="right"/>
-            </w:pPr>
-            <w:r>
-              <w:t xml:space="preserve">≈ ₹42,380</w:t>
+              <w:t xml:space="preserve">A. Committed credit block — Pro + 35,000 credits/month at ₹0.75</w:t>
+            </w:r>
+          </w:p>
+        </w:tc>
+        <w:tc>
+          <w:tcPr/>
+          <w:p>
+            <w:pPr>
+              <w:pStyle w:val="Compact"/>
+              <w:jc w:val="right"/>
+            </w:pPr>
+            <w:r>
+              <w:t xml:space="preserve">≈ ₹46,250</w:t>
+            </w:r>
+          </w:p>
+        </w:tc>
+        <w:tc>
+          <w:tcPr/>
+          <w:p>
+            <w:pPr>
+              <w:pStyle w:val="Compact"/>
+              <w:jc w:val="right"/>
+            </w:pPr>
+            <w:r>
+              <w:t xml:space="preserve">≈ ₹15,100</w:t>
+            </w:r>
+          </w:p>
+        </w:tc>
+        <w:tc>
+          <w:tcPr/>
+          <w:p>
+            <w:pPr>
+              <w:pStyle w:val="Compact"/>
+              <w:jc w:val="right"/>
+            </w:pPr>
+            <w:r>
+              <w:t xml:space="preserve">≈ ₹31,100</w:t>
             </w:r>
           </w:p>
         </w:tc>
@@ -3565,13 +3602,25 @@
         <w:pStyle w:val="BodyText"/>
       </w:pPr>
       <w:r>
-        <w:t xml:space="preserve">B is the safer margin; A is the bigger top line. Either way the customer pays</w:t>
-      </w:r>
-      <w:r>
-        <w:t xml:space="preserve"> </w:t>
-      </w:r>
-      <w:r>
-        <w:t xml:space="preserve">55–70% less than the US$1,500/month they paid their previous vendor.</w:t>
+        <w:t xml:space="preserve">At these assumptions B is both the safer and the larger margin; A only wins if</w:t>
+      </w:r>
+      <w:r>
+        <w:t xml:space="preserve"> </w:t>
+      </w:r>
+      <w:r>
+        <w:t xml:space="preserve">real conversations turn out much shorter than eight replies. Either way the</w:t>
+      </w:r>
+      <w:r>
+        <w:t xml:space="preserve"> </w:t>
+      </w:r>
+      <w:r>
+        <w:t xml:space="preserve">customer pays 65–75% less than the US$1,500/month they paid their previous</w:t>
+      </w:r>
+      <w:r>
+        <w:t xml:space="preserve"> </w:t>
+      </w:r>
+      <w:r>
+        <w:t xml:space="preserve">vendor.</w:t>
       </w:r>
     </w:p>
     <w:p>
@@ -4049,31 +4098,94 @@
         <w:t xml:space="preserve"> </w:t>
       </w:r>
       <w:r>
-        <w:t xml:space="preserve">model-family prices and swallows write failures. It is analytics, not a</w:t>
-      </w:r>
-      <w:r>
-        <w:t xml:space="preserve"> </w:t>
-      </w:r>
-      <w:r>
-        <w:t xml:space="preserve">ledger; customers must not be debited from it without a redesign that covers</w:t>
-      </w:r>
-      <w:r>
-        <w:t xml:space="preserve"> </w:t>
-      </w:r>
-      <w:r>
-        <w:t xml:space="preserve">atomic reservations and debits, idempotent payment webhooks, concurrent calls,</w:t>
-      </w:r>
-      <w:r>
-        <w:t xml:space="preserve"> </w:t>
-      </w:r>
-      <w:r>
-        <w:t xml:space="preserve">expiry, refunds, duplicate provider events, cache-specific and exact-model</w:t>
-      </w:r>
-      <w:r>
-        <w:t xml:space="preserve"> </w:t>
-      </w:r>
-      <w:r>
-        <w:t xml:space="preserve">pricing, customer caps and reconciliation.</w:t>
+        <w:t xml:space="preserve">model-family prices and swallows write failures. It prices anything named</w:t>
+      </w:r>
+      <w:r>
+        <w:t xml:space="preserve"> </w:t>
+      </w:r>
+      <w:r>
+        <w:t xml:space="preserve">“sonnet”</w:t>
+      </w:r>
+      <w:r>
+        <w:t xml:space="preserve"> </w:t>
+      </w:r>
+      <w:r>
+        <w:t xml:space="preserve">at US$3 / US$15, so the founder-side AI-cost analytics currently</w:t>
+      </w:r>
+      <w:r>
+        <w:t xml:space="preserve"> </w:t>
+      </w:r>
+      <w:r>
+        <w:rPr>
+          <w:b/>
+          <w:bCs/>
+        </w:rPr>
+        <w:t xml:space="preserve">overstate Sonnet 5 cost by 50%</w:t>
+      </w:r>
+      <w:r>
+        <w:t xml:space="preserve"> </w:t>
+      </w:r>
+      <w:r>
+        <w:t xml:space="preserve">and ignore cache tokens. It is analytics,</w:t>
+      </w:r>
+      <w:r>
+        <w:t xml:space="preserve"> </w:t>
+      </w:r>
+      <w:r>
+        <w:t xml:space="preserve">not a ledger; customers must not be debited from it.</w:t>
+      </w:r>
+    </w:p>
+    <w:p>
+      <w:pPr>
+        <w:pStyle w:val="BodyText"/>
+      </w:pPr>
+      <w:r>
+        <w:t xml:space="preserve">The build that turns credits into a real balance is specified in</w:t>
+      </w:r>
+      <w:r>
+        <w:t xml:space="preserve"> </w:t>
+      </w:r>
+      <w:r>
+        <w:rPr>
+          <w:rStyle w:val="VerbatimChar"/>
+        </w:rPr>
+        <w:t xml:space="preserve">docs/superpowers/plans/2026-09-15-credit-ledger.md</w:t>
+      </w:r>
+      <w:r>
+        <w:t xml:space="preserve"> </w:t>
+      </w:r>
+      <w:r>
+        <w:t xml:space="preserve">(≈35 hours, nine</w:t>
+      </w:r>
+      <w:r>
+        <w:t xml:space="preserve"> </w:t>
+      </w:r>
+      <w:r>
+        <w:t xml:space="preserve">independently shippable tasks): an exact-model rate card, an org-scoped grant</w:t>
+      </w:r>
+      <w:r>
+        <w:t xml:space="preserve"> </w:t>
+      </w:r>
+      <w:r>
+        <w:t xml:space="preserve">and debit ledger debited at the model-router doorway, calendar-month resets,</w:t>
+      </w:r>
+      <w:r>
+        <w:t xml:space="preserve"> </w:t>
+      </w:r>
+      <w:r>
+        <w:t xml:space="preserve">top-up purchase through the existing Razorpay/Stripe flow, founder grants,</w:t>
+      </w:r>
+      <w:r>
+        <w:t xml:space="preserve"> </w:t>
+      </w:r>
+      <w:r>
+        <w:t xml:space="preserve">and a balance on Settings → Billing. It carries six founder decisions that</w:t>
+      </w:r>
+      <w:r>
+        <w:t xml:space="preserve"> </w:t>
+      </w:r>
+      <w:r>
+        <w:t xml:space="preserve">must be answered before it ships.</w:t>
       </w:r>
     </w:p>
     <w:bookmarkEnd w:id="31"/>
@@ -5265,7 +5377,7 @@
       <w:color w:themeColor="accent1" w:themeShade="BF" w:val="365F91"/>
     </w:rPr>
   </w:style>
-  <w:style w:customStyle="1" w:styleId="SourceCode" w:type="paragraph">
+  <w:style w:type="paragraph" w:customStyle="1" w:styleId="SourceCode">
     <w:name w:val="Source Code"/>
     <w:basedOn w:val="Normal"/>
     <w:link w:val="VerbatimChar"/>
@@ -5273,7 +5385,7 @@
       <w:wordWrap w:val="off"/>
     </w:pPr>
   </w:style>
-  <w:style w:customStyle="1" w:styleId="KeywordTok" w:type="character">
+  <w:style w:type="character" w:customStyle="1" w:styleId="KeywordTok">
     <w:name w:val="KeywordTok"/>
     <w:basedOn w:val="VerbatimChar"/>
     <w:rPr>
@@ -5281,77 +5393,77 @@
       <w:color w:val="007020"/>
     </w:rPr>
   </w:style>
-  <w:style w:customStyle="1" w:styleId="DataTypeTok" w:type="character">
+  <w:style w:type="character" w:customStyle="1" w:styleId="DataTypeTok">
     <w:name w:val="DataTypeTok"/>
     <w:basedOn w:val="VerbatimChar"/>
     <w:rPr>
       <w:color w:val="902000"/>
     </w:rPr>
   </w:style>
-  <w:style w:customStyle="1" w:styleId="DecValTok" w:type="character">
+  <w:style w:type="character" w:customStyle="1" w:styleId="DecValTok">
     <w:name w:val="DecValTok"/>
     <w:basedOn w:val="VerbatimChar"/>
     <w:rPr>
       <w:color w:val="40a070"/>
     </w:rPr>
   </w:style>
-  <w:style w:customStyle="1" w:styleId="BaseNTok" w:type="character">
+  <w:style w:type="character" w:customStyle="1" w:styleId="BaseNTok">
     <w:name w:val="BaseNTok"/>
     <w:basedOn w:val="VerbatimChar"/>
     <w:rPr>
       <w:color w:val="40a070"/>
     </w:rPr>
   </w:style>
-  <w:style w:customStyle="1" w:styleId="FloatTok" w:type="character">
+  <w:style w:type="character" w:customStyle="1" w:styleId="FloatTok">
     <w:name w:val="FloatTok"/>
     <w:basedOn w:val="VerbatimChar"/>
     <w:rPr>
       <w:color w:val="40a070"/>
     </w:rPr>
   </w:style>
-  <w:style w:customStyle="1" w:styleId="ConstantTok" w:type="character">
+  <w:style w:type="character" w:customStyle="1" w:styleId="ConstantTok">
     <w:name w:val="ConstantTok"/>
     <w:basedOn w:val="VerbatimChar"/>
     <w:rPr>
       <w:color w:val="880000"/>
     </w:rPr>
   </w:style>
-  <w:style w:customStyle="1" w:styleId="CharTok" w:type="character">
+  <w:style w:type="character" w:customStyle="1" w:styleId="CharTok">
     <w:name w:val="CharTok"/>
     <w:basedOn w:val="VerbatimChar"/>
     <w:rPr>
       <w:color w:val="4070a0"/>
     </w:rPr>
   </w:style>
-  <w:style w:customStyle="1" w:styleId="SpecialCharTok" w:type="character">
+  <w:style w:type="character" w:customStyle="1" w:styleId="SpecialCharTok">
     <w:name w:val="SpecialCharTok"/>
     <w:basedOn w:val="VerbatimChar"/>
     <w:rPr>
       <w:color w:val="4070a0"/>
     </w:rPr>
   </w:style>
-  <w:style w:customStyle="1" w:styleId="StringTok" w:type="character">
+  <w:style w:type="character" w:customStyle="1" w:styleId="StringTok">
     <w:name w:val="StringTok"/>
     <w:basedOn w:val="VerbatimChar"/>
     <w:rPr>
       <w:color w:val="4070a0"/>
     </w:rPr>
   </w:style>
-  <w:style w:customStyle="1" w:styleId="VerbatimStringTok" w:type="character">
+  <w:style w:type="character" w:customStyle="1" w:styleId="VerbatimStringTok">
     <w:name w:val="VerbatimStringTok"/>
     <w:basedOn w:val="VerbatimChar"/>
     <w:rPr>
       <w:color w:val="4070a0"/>
     </w:rPr>
   </w:style>
-  <w:style w:customStyle="1" w:styleId="SpecialStringTok" w:type="character">
+  <w:style w:type="character" w:customStyle="1" w:styleId="SpecialStringTok">
     <w:name w:val="SpecialStringTok"/>
     <w:basedOn w:val="VerbatimChar"/>
     <w:rPr>
       <w:color w:val="bb6688"/>
     </w:rPr>
   </w:style>
-  <w:style w:customStyle="1" w:styleId="ImportTok" w:type="character">
+  <w:style w:type="character" w:customStyle="1" w:styleId="ImportTok">
     <w:name w:val="ImportTok"/>
     <w:basedOn w:val="VerbatimChar"/>
     <w:rPr>
@@ -5359,7 +5471,7 @@
       <w:color w:val="008000"/>
     </w:rPr>
   </w:style>
-  <w:style w:customStyle="1" w:styleId="CommentTok" w:type="character">
+  <w:style w:type="character" w:customStyle="1" w:styleId="CommentTok">
     <w:name w:val="CommentTok"/>
     <w:basedOn w:val="VerbatimChar"/>
     <w:rPr>
@@ -5367,7 +5479,7 @@
       <w:color w:val="60a0b0"/>
     </w:rPr>
   </w:style>
-  <w:style w:customStyle="1" w:styleId="DocumentationTok" w:type="character">
+  <w:style w:type="character" w:customStyle="1" w:styleId="DocumentationTok">
     <w:name w:val="DocumentationTok"/>
     <w:basedOn w:val="VerbatimChar"/>
     <w:rPr>
@@ -5375,7 +5487,7 @@
       <w:color w:val="ba2121"/>
     </w:rPr>
   </w:style>
-  <w:style w:customStyle="1" w:styleId="AnnotationTok" w:type="character">
+  <w:style w:type="character" w:customStyle="1" w:styleId="AnnotationTok">
     <w:name w:val="AnnotationTok"/>
     <w:basedOn w:val="VerbatimChar"/>
     <w:rPr>
@@ -5384,7 +5496,7 @@
       <w:color w:val="60a0b0"/>
     </w:rPr>
   </w:style>
-  <w:style w:customStyle="1" w:styleId="CommentVarTok" w:type="character">
+  <w:style w:type="character" w:customStyle="1" w:styleId="CommentVarTok">
     <w:name w:val="CommentVarTok"/>
     <w:basedOn w:val="VerbatimChar"/>
     <w:rPr>
@@ -5393,28 +5505,28 @@
       <w:color w:val="60a0b0"/>
     </w:rPr>
   </w:style>
-  <w:style w:customStyle="1" w:styleId="OtherTok" w:type="character">
+  <w:style w:type="character" w:customStyle="1" w:styleId="OtherTok">
     <w:name w:val="OtherTok"/>
     <w:basedOn w:val="VerbatimChar"/>
     <w:rPr>
       <w:color w:val="007020"/>
     </w:rPr>
   </w:style>
-  <w:style w:customStyle="1" w:styleId="FunctionTok" w:type="character">
+  <w:style w:type="character" w:customStyle="1" w:styleId="FunctionTok">
     <w:name w:val="FunctionTok"/>
     <w:basedOn w:val="VerbatimChar"/>
     <w:rPr>
       <w:color w:val="06287e"/>
     </w:rPr>
   </w:style>
-  <w:style w:customStyle="1" w:styleId="VariableTok" w:type="character">
+  <w:style w:type="character" w:customStyle="1" w:styleId="VariableTok">
     <w:name w:val="VariableTok"/>
     <w:basedOn w:val="VerbatimChar"/>
     <w:rPr>
       <w:color w:val="19177c"/>
     </w:rPr>
   </w:style>
-  <w:style w:customStyle="1" w:styleId="ControlFlowTok" w:type="character">
+  <w:style w:type="character" w:customStyle="1" w:styleId="ControlFlowTok">
     <w:name w:val="ControlFlowTok"/>
     <w:basedOn w:val="VerbatimChar"/>
     <w:rPr>
@@ -5422,45 +5534,45 @@
       <w:color w:val="007020"/>
     </w:rPr>
   </w:style>
-  <w:style w:customStyle="1" w:styleId="OperatorTok" w:type="character">
+  <w:style w:type="character" w:customStyle="1" w:styleId="OperatorTok">
     <w:name w:val="OperatorTok"/>
     <w:basedOn w:val="VerbatimChar"/>
     <w:rPr>
       <w:color w:val="666666"/>
     </w:rPr>
   </w:style>
-  <w:style w:customStyle="1" w:styleId="BuiltInTok" w:type="character">
+  <w:style w:type="character" w:customStyle="1" w:styleId="BuiltInTok">
     <w:name w:val="BuiltInTok"/>
     <w:basedOn w:val="VerbatimChar"/>
     <w:rPr>
       <w:color w:val="008000"/>
     </w:rPr>
   </w:style>
-  <w:style w:customStyle="1" w:styleId="ExtensionTok" w:type="character">
+  <w:style w:type="character" w:customStyle="1" w:styleId="ExtensionTok">
     <w:name w:val="ExtensionTok"/>
     <w:basedOn w:val="VerbatimChar"/>
     <w:rPr/>
   </w:style>
-  <w:style w:customStyle="1" w:styleId="PreprocessorTok" w:type="character">
+  <w:style w:type="character" w:customStyle="1" w:styleId="PreprocessorTok">
     <w:name w:val="PreprocessorTok"/>
     <w:basedOn w:val="VerbatimChar"/>
     <w:rPr>
       <w:color w:val="bc7a00"/>
     </w:rPr>
   </w:style>
-  <w:style w:customStyle="1" w:styleId="AttributeTok" w:type="character">
+  <w:style w:type="character" w:customStyle="1" w:styleId="AttributeTok">
     <w:name w:val="AttributeTok"/>
     <w:basedOn w:val="VerbatimChar"/>
     <w:rPr>
       <w:color w:val="7d9029"/>
     </w:rPr>
   </w:style>
-  <w:style w:customStyle="1" w:styleId="RegionMarkerTok" w:type="character">
+  <w:style w:type="character" w:customStyle="1" w:styleId="RegionMarkerTok">
     <w:name w:val="RegionMarkerTok"/>
     <w:basedOn w:val="VerbatimChar"/>
     <w:rPr/>
   </w:style>
-  <w:style w:customStyle="1" w:styleId="InformationTok" w:type="character">
+  <w:style w:type="character" w:customStyle="1" w:styleId="InformationTok">
     <w:name w:val="InformationTok"/>
     <w:basedOn w:val="VerbatimChar"/>
     <w:rPr>
@@ -5469,7 +5581,7 @@
       <w:color w:val="60a0b0"/>
     </w:rPr>
   </w:style>
-  <w:style w:customStyle="1" w:styleId="WarningTok" w:type="character">
+  <w:style w:type="character" w:customStyle="1" w:styleId="WarningTok">
     <w:name w:val="WarningTok"/>
     <w:basedOn w:val="VerbatimChar"/>
     <w:rPr>
@@ -5478,7 +5590,7 @@
       <w:color w:val="60a0b0"/>
     </w:rPr>
   </w:style>
-  <w:style w:customStyle="1" w:styleId="AlertTok" w:type="character">
+  <w:style w:type="character" w:customStyle="1" w:styleId="AlertTok">
     <w:name w:val="AlertTok"/>
     <w:basedOn w:val="VerbatimChar"/>
     <w:rPr>
@@ -5486,7 +5598,7 @@
       <w:color w:val="ff0000"/>
     </w:rPr>
   </w:style>
-  <w:style w:customStyle="1" w:styleId="ErrorTok" w:type="character">
+  <w:style w:type="character" w:customStyle="1" w:styleId="ErrorTok">
     <w:name w:val="ErrorTok"/>
     <w:basedOn w:val="VerbatimChar"/>
     <w:rPr>
@@ -5494,7 +5606,7 @@
       <w:color w:val="ff0000"/>
     </w:rPr>
   </w:style>
-  <w:style w:customStyle="1" w:styleId="NormalTok" w:type="character">
+  <w:style w:type="character" w:customStyle="1" w:styleId="NormalTok">
     <w:name w:val="NormalTok"/>
     <w:basedOn w:val="VerbatimChar"/>
     <w:rPr/>

</xml_diff>

<commit_message>
docs(billing): record founder credit decisions; voice and setup out of the ledger
2026-09-15 decisions: rate card on Sonnet 5; voice minutes included free
and outside the ledger (minute cap stays); concierge knowledge ingest/
distill absorbed by Nudge; included credits reset on the customer's
payment date (grant keyed on currentPeriodEnd, issued at activation and
back-filled by cron for comped/enterprise orgs); comped plans must be
active in admin; one-call overdraft accepted. Plan and pricing record
amended; .docx regenerated.

Co-Authored-By: Claude Opus 5 (1M context) <noreply@anthropic.com>
(cherry picked from commit 4d994f3ff203c449310f9aea3e9e2ce47eb1f9cb)
</commit_message>
<xml_diff>
--- a/docs/NUDGE_PRICING_EXPLAINED_UPDATED.docx
+++ b/docs/NUDGE_PRICING_EXPLAINED_UPDATED.docx
@@ -1098,18 +1098,18 @@
               <w:pStyle w:val="Compact"/>
             </w:pPr>
             <w:r>
-              <w:t xml:space="preserve">Voice on an eligible plan (Nudge-funded speech + carrier)</w:t>
-            </w:r>
-          </w:p>
-        </w:tc>
-        <w:tc>
-          <w:tcPr/>
-          <w:p>
-            <w:pPr>
-              <w:pStyle w:val="Compact"/>
-            </w:pPr>
-            <w:r>
-              <w:t xml:space="preserve">Yes</w:t>
+              <w:t xml:space="preserve">Voice calls (Pro’s 100 minutes, Enterprise as agreed)</w:t>
+            </w:r>
+          </w:p>
+        </w:tc>
+        <w:tc>
+          <w:tcPr/>
+          <w:p>
+            <w:pPr>
+              <w:pStyle w:val="Compact"/>
+            </w:pPr>
+            <w:r>
+              <w:t xml:space="preserve">No — voice is limited by included minutes, not credits (founder decision 2026-09-15)</w:t>
             </w:r>
           </w:p>
         </w:tc>
@@ -1270,37 +1270,61 @@
         <w:t xml:space="preserve"> </w:t>
       </w:r>
       <w:r>
-        <w:t xml:space="preserve">Included credits reset every billing cycle. Purchased credits</w:t>
-      </w:r>
-      <w:r>
-        <w:t xml:space="preserve"> </w:t>
-      </w:r>
-      <w:r>
-        <w:t xml:space="preserve">expire 12 months after purchase; the soonest-expiring eligible balance is spent</w:t>
-      </w:r>
-      <w:r>
-        <w:t xml:space="preserve"> </w:t>
-      </w:r>
-      <w:r>
-        <w:t xml:space="preserve">first. Auto-recharge is off by default. A zero balance pauses Nudge-funded AI</w:t>
-      </w:r>
-      <w:r>
-        <w:t xml:space="preserve"> </w:t>
-      </w:r>
-      <w:r>
-        <w:t xml:space="preserve">and voice, never the manual inbox, campaigns or follow-ups the plan already</w:t>
-      </w:r>
-      <w:r>
-        <w:t xml:space="preserve"> </w:t>
-      </w:r>
-      <w:r>
-        <w:t xml:space="preserve">includes. Simulation mode never consumes purchased credit. Nudge absorbs its</w:t>
-      </w:r>
-      <w:r>
-        <w:t xml:space="preserve"> </w:t>
-      </w:r>
-      <w:r>
-        <w:t xml:space="preserve">own failed or retried AI work; a customer-requested regeneration is new usage.</w:t>
+        <w:t xml:space="preserve">Included credits are issued fresh with each monthly payment</w:t>
+      </w:r>
+      <w:r>
+        <w:t xml:space="preserve"> </w:t>
+      </w:r>
+      <w:r>
+        <w:t xml:space="preserve">and expire at the end of that paid period (founder decision 2026-09-15: reset</w:t>
+      </w:r>
+      <w:r>
+        <w:t xml:space="preserve"> </w:t>
+      </w:r>
+      <w:r>
+        <w:t xml:space="preserve">on the payment date, not the calendar month). Purchased credits expire 12</w:t>
+      </w:r>
+      <w:r>
+        <w:t xml:space="preserve"> </w:t>
+      </w:r>
+      <w:r>
+        <w:t xml:space="preserve">months after purchase; the soonest-expiring eligible balance is spent first.</w:t>
+      </w:r>
+      <w:r>
+        <w:t xml:space="preserve"> </w:t>
+      </w:r>
+      <w:r>
+        <w:t xml:space="preserve">Auto-recharge is off by default. A zero balance pauses Nudge-funded AI replies,</w:t>
+      </w:r>
+      <w:r>
+        <w:t xml:space="preserve"> </w:t>
+      </w:r>
+      <w:r>
+        <w:t xml:space="preserve">drafts, summaries and campaign copy — never the manual inbox, campaigns,</w:t>
+      </w:r>
+      <w:r>
+        <w:t xml:space="preserve"> </w:t>
+      </w:r>
+      <w:r>
+        <w:t xml:space="preserve">follow-ups or voice the plan already includes. Simulation mode never consumes</w:t>
+      </w:r>
+      <w:r>
+        <w:t xml:space="preserve"> </w:t>
+      </w:r>
+      <w:r>
+        <w:t xml:space="preserve">purchased credit. Nudge absorbs its own failed or retried AI work and the AI</w:t>
+      </w:r>
+      <w:r>
+        <w:t xml:space="preserve"> </w:t>
+      </w:r>
+      <w:r>
+        <w:t xml:space="preserve">used to set up a customer’s knowledge base during onboarding; a</w:t>
+      </w:r>
+      <w:r>
+        <w:t xml:space="preserve"> </w:t>
+      </w:r>
+      <w:r>
+        <w:t xml:space="preserve">customer-requested regeneration is new usage.</w:t>
       </w:r>
     </w:p>
     <w:p>
@@ -3276,31 +3300,43 @@
         <w:pStyle w:val="BodyText"/>
       </w:pPr>
       <w:r>
-        <w:t xml:space="preserve">Voice draws on the same credit balance. At the assumed US$0.15/minute, Pro’s 5,000</w:t>
-      </w:r>
-      <w:r>
-        <w:t xml:space="preserve"> </w:t>
-      </w:r>
-      <w:r>
-        <w:t xml:space="preserve">credits buy about 166 voice minutes if used for nothing else (at US$0.25, 100</w:t>
-      </w:r>
-      <w:r>
-        <w:t xml:space="preserve"> </w:t>
-      </w:r>
-      <w:r>
-        <w:t xml:space="preserve">minutes). Never advertise the full chat allowance and the full voice allowance</w:t>
-      </w:r>
-      <w:r>
-        <w:t xml:space="preserve"> </w:t>
-      </w:r>
-      <w:r>
-        <w:t xml:space="preserve">as simultaneously included. The voice figure is an assumption, not a carrier</w:t>
-      </w:r>
-      <w:r>
-        <w:t xml:space="preserve"> </w:t>
-      </w:r>
-      <w:r>
-        <w:t xml:space="preserve">quote; verify speech, inference and carrier costs before selling live voice.</w:t>
+        <w:t xml:space="preserve">Voice does not use credits (founder decision 2026-09-15). Pro’s 100 included</w:t>
+      </w:r>
+      <w:r>
+        <w:t xml:space="preserve"> </w:t>
+      </w:r>
+      <w:r>
+        <w:t xml:space="preserve">minutes are limited by the per-plan minute cap, and at the assumed</w:t>
+      </w:r>
+      <w:r>
+        <w:t xml:space="preserve"> </w:t>
+      </w:r>
+      <w:r>
+        <w:t xml:space="preserve">US$0.15/minute they cost Nudge up to ₹1,350 a month if fully used — so Pro’s</w:t>
+      </w:r>
+      <w:r>
+        <w:t xml:space="preserve"> </w:t>
+      </w:r>
+      <w:r>
+        <w:t xml:space="preserve">“left after AI cost”</w:t>
+      </w:r>
+      <w:r>
+        <w:t xml:space="preserve"> </w:t>
+      </w:r>
+      <w:r>
+        <w:t xml:space="preserve">above is about ₹16,400 (82%) for a customer who also uses</w:t>
+      </w:r>
+      <w:r>
+        <w:t xml:space="preserve"> </w:t>
+      </w:r>
+      <w:r>
+        <w:t xml:space="preserve">every voice minute. The voice figure is an assumption, not a carrier quote;</w:t>
+      </w:r>
+      <w:r>
+        <w:t xml:space="preserve"> </w:t>
+      </w:r>
+      <w:r>
+        <w:t xml:space="preserve">verify speech, inference and carrier costs before selling live voice.</w:t>
       </w:r>
     </w:p>
     <w:bookmarkEnd w:id="27"/>

</xml_diff>

<commit_message>
docs(pricing): use the measured voice cost; regenerate the explainer
Fold the other session's measured ~US$0.18/min all-in voice figure (36
credits, ₹1,620 for Pro's 100 minutes, Pro left ≈ ₹16,130 / 81%) into
the record and the ledger plan in place of the US$0.15 assumption, and
regenerate the .docx from the reconciled record after replaying the
credit-ledger commits onto the merged main.

Co-Authored-By: Claude Opus 5 (1M context) <noreply@anthropic.com>
</commit_message>
<xml_diff>
--- a/docs/NUDGE_PRICING_EXPLAINED_UPDATED.docx
+++ b/docs/NUDGE_PRICING_EXPLAINED_UPDATED.docx
@@ -1884,43 +1884,43 @@
               <w:pStyle w:val="Compact"/>
             </w:pPr>
             <w:r>
-              <w:t xml:space="preserve">One voice minute (assumed US$0.15 all-in)</w:t>
-            </w:r>
-          </w:p>
-        </w:tc>
-        <w:tc>
-          <w:tcPr/>
-          <w:p>
-            <w:pPr>
-              <w:pStyle w:val="Compact"/>
-              <w:jc w:val="right"/>
-            </w:pPr>
-            <w:r>
-              <w:t xml:space="preserve">30</w:t>
-            </w:r>
-          </w:p>
-        </w:tc>
-        <w:tc>
-          <w:tcPr/>
-          <w:p>
-            <w:pPr>
-              <w:pStyle w:val="Compact"/>
-              <w:jc w:val="right"/>
-            </w:pPr>
-            <w:r>
-              <w:t xml:space="preserve">₹13.50</w:t>
-            </w:r>
-          </w:p>
-        </w:tc>
-        <w:tc>
-          <w:tcPr/>
-          <w:p>
-            <w:pPr>
-              <w:pStyle w:val="Compact"/>
-              <w:jc w:val="right"/>
-            </w:pPr>
-            <w:r>
-              <w:t xml:space="preserve">₹29.97</w:t>
+              <w:t xml:space="preserve">One voice minute (measured about US$0.18 all-in)</w:t>
+            </w:r>
+          </w:p>
+        </w:tc>
+        <w:tc>
+          <w:tcPr/>
+          <w:p>
+            <w:pPr>
+              <w:pStyle w:val="Compact"/>
+              <w:jc w:val="right"/>
+            </w:pPr>
+            <w:r>
+              <w:t xml:space="preserve">36</w:t>
+            </w:r>
+          </w:p>
+        </w:tc>
+        <w:tc>
+          <w:tcPr/>
+          <w:p>
+            <w:pPr>
+              <w:pStyle w:val="Compact"/>
+              <w:jc w:val="right"/>
+            </w:pPr>
+            <w:r>
+              <w:t xml:space="preserve">₹16.20</w:t>
+            </w:r>
+          </w:p>
+        </w:tc>
+        <w:tc>
+          <w:tcPr/>
+          <w:p>
+            <w:pPr>
+              <w:pStyle w:val="Compact"/>
+              <w:jc w:val="right"/>
+            </w:pPr>
+            <w:r>
+              <w:t xml:space="preserve">₹35.96</w:t>
             </w:r>
           </w:p>
         </w:tc>
@@ -2030,7 +2030,7 @@
               <w:jc w:val="right"/>
             </w:pPr>
             <w:r>
-              <w:t xml:space="preserve">143</w:t>
+              <w:t xml:space="preserve">142</w:t>
             </w:r>
           </w:p>
         </w:tc>
@@ -2054,7 +2054,7 @@
               <w:jc w:val="right"/>
             </w:pPr>
             <w:r>
-              <w:t xml:space="preserve">1,786</w:t>
+              <w:t xml:space="preserve">1,785</w:t>
             </w:r>
           </w:p>
         </w:tc>
@@ -3306,13 +3306,19 @@
         <w:t xml:space="preserve"> </w:t>
       </w:r>
       <w:r>
-        <w:t xml:space="preserve">minutes are limited by the per-plan minute cap, and at the assumed</w:t>
-      </w:r>
-      <w:r>
-        <w:t xml:space="preserve"> </w:t>
-      </w:r>
-      <w:r>
-        <w:t xml:space="preserve">US$0.15/minute they cost Nudge up to ₹1,350 a month if fully used — so Pro’s</w:t>
+        <w:t xml:space="preserve">minutes are limited by the per-plan minute cap, and at the measured</w:t>
+      </w:r>
+      <w:r>
+        <w:t xml:space="preserve"> </w:t>
+      </w:r>
+      <w:r>
+        <w:t xml:space="preserve">~US$0.18/minute all-in they cost Nudge up to ₹1,620 a month if fully used — so</w:t>
+      </w:r>
+      <w:r>
+        <w:t xml:space="preserve"> </w:t>
+      </w:r>
+      <w:r>
+        <w:t xml:space="preserve">Pro’s</w:t>
       </w:r>
       <w:r>
         <w:t xml:space="preserve"> </w:t>
@@ -3324,19 +3330,19 @@
         <w:t xml:space="preserve"> </w:t>
       </w:r>
       <w:r>
-        <w:t xml:space="preserve">above is about ₹16,400 (82%) for a customer who also uses</w:t>
-      </w:r>
-      <w:r>
-        <w:t xml:space="preserve"> </w:t>
-      </w:r>
-      <w:r>
-        <w:t xml:space="preserve">every voice minute. The voice figure is an assumption, not a carrier quote;</w:t>
-      </w:r>
-      <w:r>
-        <w:t xml:space="preserve"> </w:t>
-      </w:r>
-      <w:r>
-        <w:t xml:space="preserve">verify speech, inference and carrier costs before selling live voice.</w:t>
+        <w:t xml:space="preserve">above is about ₹16,130 (81%) for a customer who</w:t>
+      </w:r>
+      <w:r>
+        <w:t xml:space="preserve"> </w:t>
+      </w:r>
+      <w:r>
+        <w:t xml:space="preserve">also uses every voice minute. Re-check the per-minute figure against real</w:t>
+      </w:r>
+      <w:r>
+        <w:t xml:space="preserve"> </w:t>
+      </w:r>
+      <w:r>
+        <w:t xml:space="preserve">carrier and ElevenLabs invoices before selling live voice at volume.</w:t>
       </w:r>
     </w:p>
     <w:bookmarkEnd w:id="27"/>
@@ -3409,13 +3415,13 @@
           <w:b/>
           <w:bCs/>
         </w:rPr>
-        <w:t xml:space="preserve">credits ≈ ₹15,100 of AI cost a month on Sonnet 5</w:t>
-      </w:r>
-      <w:r>
-        <w:t xml:space="preserve"> </w:t>
-      </w:r>
-      <w:r>
-        <w:t xml:space="preserve">(≈ ₹7,600 on Haiku). Pro’s</w:t>
+        <w:t xml:space="preserve">credits ≈ ₹15,120 of AI cost a month on Sonnet 5</w:t>
+      </w:r>
+      <w:r>
+        <w:t xml:space="preserve"> </w:t>
+      </w:r>
+      <w:r>
+        <w:t xml:space="preserve">(≈ ₹7,560 on Haiku). Pro’s</w:t>
       </w:r>
       <w:r>
         <w:t xml:space="preserve"> </w:t>
@@ -3544,19 +3550,19 @@
               <w:jc w:val="right"/>
             </w:pPr>
             <w:r>
-              <w:t xml:space="preserve">≈ ₹15,100</w:t>
-            </w:r>
-          </w:p>
-        </w:tc>
-        <w:tc>
-          <w:tcPr/>
-          <w:p>
-            <w:pPr>
-              <w:pStyle w:val="Compact"/>
-              <w:jc w:val="right"/>
-            </w:pPr>
-            <w:r>
-              <w:t xml:space="preserve">≈ ₹31,100</w:t>
+              <w:t xml:space="preserve">≈ ₹15,120</w:t>
+            </w:r>
+          </w:p>
+        </w:tc>
+        <w:tc>
+          <w:tcPr/>
+          <w:p>
+            <w:pPr>
+              <w:pStyle w:val="Compact"/>
+              <w:jc w:val="right"/>
+            </w:pPr>
+            <w:r>
+              <w:t xml:space="preserve">≈ ₹31,130</w:t>
             </w:r>
           </w:p>
         </w:tc>

</xml_diff>

<commit_message>
docs(pricing): record says the ledger is built — and what must happen before deploy
§3/§7 of the pricing record now describe the credit ledger as built in
code on main (tasks 1–8), spell out the production order — db:push,
db:rls, then deploy — and the exact failure if that order is reversed.
§8 step 2 becomes the rollout watch instead of the build. PROGRESS
entry for 2026-09-16 including the main-reset recovery. Explainer .docx
regenerated.

Co-Authored-By: Claude Opus 5 (1M context) <noreply@anthropic.com>
</commit_message>
<xml_diff>
--- a/docs/NUDGE_PRICING_EXPLAINED_UPDATED.docx
+++ b/docs/NUDGE_PRICING_EXPLAINED_UPDATED.docx
@@ -989,13 +989,13 @@
     </w:p>
     <w:bookmarkEnd w:id="21"/>
     <w:bookmarkEnd w:id="22"/>
-    <w:bookmarkStart w:id="23" w:name="X937d473cb58f16e257ffb964bffa55698aa6c90"/>
+    <w:bookmarkStart w:id="23" w:name="X6cd8fcbe785049e83711b644a08f14e5aeeb295"/>
     <w:p>
       <w:pPr>
         <w:pStyle w:val="Heading2"/>
       </w:pPr>
       <w:r>
-        <w:t xml:space="preserve">3. Credits (decided policy; NOT yet built — see §7)</w:t>
+        <w:t xml:space="preserve">3. Credits (decided policy; built in code 2026-09-16 — see §7 for what is live)</w:t>
       </w:r>
     </w:p>
     <w:p>
@@ -3893,13 +3893,13 @@
       </w:r>
     </w:p>
     <w:bookmarkEnd w:id="30"/>
-    <w:bookmarkStart w:id="31" w:name="Xc8ae0fbb392dd6255a25a29837b6d8679d59310"/>
+    <w:bookmarkStart w:id="31" w:name="X63fc35759943d312549d38a6558f94a4d3c4c07"/>
     <w:p>
       <w:pPr>
         <w:pStyle w:val="Heading2"/>
       </w:pPr>
       <w:r>
-        <w:t xml:space="preserve">7. What is built and what is not (the truth as of 2026-09-15)</w:t>
+        <w:t xml:space="preserve">7. What is built and what is not (the truth as of 2026-09-16)</w:t>
       </w:r>
     </w:p>
     <w:p>
@@ -3907,7 +3907,7 @@
         <w:pStyle w:val="FirstParagraph"/>
       </w:pPr>
       <w:r>
-        <w:t xml:space="preserve">Built and live:</w:t>
+        <w:t xml:space="preserve">Built and live in production:</w:t>
       </w:r>
       <w:r>
         <w:t xml:space="preserve"> </w:t>
@@ -4041,59 +4041,7 @@
         <w:pStyle w:val="BodyText"/>
       </w:pPr>
       <w:r>
-        <w:t xml:space="preserve">Not built (a customer today gets</w:t>
-      </w:r>
-      <w:r>
-        <w:t xml:space="preserve"> </w:t>
-      </w:r>
-      <w:r>
-        <w:rPr>
-          <w:i/>
-          <w:iCs/>
-        </w:rPr>
-        <w:t xml:space="preserve">at least</w:t>
-      </w:r>
-      <w:r>
-        <w:t xml:space="preserve"> </w:t>
-      </w:r>
-      <w:r>
-        <w:t xml:space="preserve">the promised credits and nothing</w:t>
-      </w:r>
-      <w:r>
-        <w:t xml:space="preserve"> </w:t>
-      </w:r>
-      <w:r>
-        <w:t xml:space="preserve">stops them beyond it — Nudge silently absorbs the cost):</w:t>
-      </w:r>
-      <w:r>
-        <w:t xml:space="preserve"> </w:t>
-      </w:r>
-      <w:r>
-        <w:t xml:space="preserve">- A credit ledger: balance, deduction per AI call, reset each cycle, expiry.</w:t>
-      </w:r>
-      <w:r>
-        <w:t xml:space="preserve"> </w:t>
-      </w:r>
-      <w:r>
-        <w:t xml:space="preserve">- Any cap or pause when a balance reaches zero.</w:t>
-      </w:r>
-      <w:r>
-        <w:t xml:space="preserve"> </w:t>
-      </w:r>
-      <w:r>
-        <w:t xml:space="preserve">- Top-up pack purchase, auto-recharge, spending limits, balance UI.</w:t>
-      </w:r>
-      <w:r>
-        <w:t xml:space="preserve"> </w:t>
-      </w:r>
-      <w:r>
-        <w:t xml:space="preserve">- Trial credit enforcement (the 100-credit trial allowance).</w:t>
-      </w:r>
-      <w:r>
-        <w:t xml:space="preserve"> </w:t>
-      </w:r>
-      <w:r>
-        <w:t xml:space="preserve">- Per-customer AI spend alerts beyond the founder-side</w:t>
+        <w:t xml:space="preserve">Built in code on</w:t>
       </w:r>
       <w:r>
         <w:t xml:space="preserve"> </w:t>
@@ -4102,22 +4050,399 @@
         <w:rPr>
           <w:rStyle w:val="VerbatimChar"/>
         </w:rPr>
-        <w:t xml:space="preserve">PLAN_COST_ALERT_PCT</w:t>
-      </w:r>
-      <w:r>
-        <w:t xml:space="preserve">.</w:t>
-      </w:r>
-      <w:r>
-        <w:t xml:space="preserve"> </w:t>
-      </w:r>
-      <w:r>
-        <w:t xml:space="preserve">- Annual checkout.</w:t>
+        <w:t xml:space="preserve">main</w:t>
+      </w:r>
+      <w:r>
+        <w:t xml:space="preserve"> </w:t>
+      </w:r>
+      <w:r>
+        <w:t xml:space="preserve">(2026-09-16),</w:t>
+      </w:r>
+      <w:r>
+        <w:t xml:space="preserve"> </w:t>
+      </w:r>
+      <w:r>
+        <w:rPr>
+          <w:b/>
+          <w:bCs/>
+        </w:rPr>
+        <w:t xml:space="preserve">not yet deployed</w:t>
+      </w:r>
+      <w:r>
+        <w:t xml:space="preserve"> </w:t>
+      </w:r>
+      <w:r>
+        <w:t xml:space="preserve">— the credit ledger,</w:t>
+      </w:r>
+      <w:r>
+        <w:t xml:space="preserve"> </w:t>
+      </w:r>
+      <w:r>
+        <w:rPr>
+          <w:rStyle w:val="VerbatimChar"/>
+        </w:rPr>
+        <w:t xml:space="preserve">docs/superpowers/plans/2026-09-15-credit-ledger.md</w:t>
+      </w:r>
+      <w:r>
+        <w:t xml:space="preserve">, tasks 1–8 of 9:</w:t>
+      </w:r>
+      <w:r>
+        <w:t xml:space="preserve"> </w:t>
+      </w:r>
+      <w:r>
+        <w:t xml:space="preserve">- An exact-model rate card (</w:t>
+      </w:r>
+      <w:r>
+        <w:rPr>
+          <w:rStyle w:val="VerbatimChar"/>
+        </w:rPr>
+        <w:t xml:space="preserve">billing/credit-rates.ts</w:t>
+      </w:r>
+      <w:r>
+        <w:t xml:space="preserve">: Sonnet 5, Haiku 4.5,</w:t>
+      </w:r>
+      <w:r>
+        <w:t xml:space="preserve"> </w:t>
+      </w:r>
+      <w:r>
+        <w:t xml:space="preserve">cache read/write priced; unknown models refused before any provider call).</w:t>
+      </w:r>
+      <w:r>
+        <w:t xml:space="preserve"> </w:t>
+      </w:r>
+      <w:r>
+        <w:t xml:space="preserve">-</w:t>
+      </w:r>
+      <w:r>
+        <w:t xml:space="preserve"> </w:t>
+      </w:r>
+      <w:r>
+        <w:rPr>
+          <w:rStyle w:val="VerbatimChar"/>
+        </w:rPr>
+        <w:t xml:space="preserve">CreditGrant</w:t>
+      </w:r>
+      <w:r>
+        <w:t xml:space="preserve"> </w:t>
+      </w:r>
+      <w:r>
+        <w:t xml:space="preserve">/</w:t>
+      </w:r>
+      <w:r>
+        <w:t xml:space="preserve"> </w:t>
+      </w:r>
+      <w:r>
+        <w:rPr>
+          <w:rStyle w:val="VerbatimChar"/>
+        </w:rPr>
+        <w:t xml:space="preserve">CreditDebit</w:t>
+      </w:r>
+      <w:r>
+        <w:t xml:space="preserve"> </w:t>
+      </w:r>
+      <w:r>
+        <w:t xml:space="preserve">tables. Every platform-paid AI call goes</w:t>
+      </w:r>
+      <w:r>
+        <w:t xml:space="preserve"> </w:t>
+      </w:r>
+      <w:r>
+        <w:t xml:space="preserve">through the model-router doorway, is preflighted (metered org at ≤ 0 →</w:t>
+      </w:r>
+      <w:r>
+        <w:t xml:space="preserve"> </w:t>
+      </w:r>
+      <w:r>
+        <w:t xml:space="preserve">refused before the provider is called), recorded, and debited exactly:</w:t>
+      </w:r>
+      <w:r>
+        <w:t xml:space="preserve"> </w:t>
+      </w:r>
+      <w:r>
+        <w:t xml:space="preserve">soonest-expiring grant first, one-call overdraft, idempotent on the usage</w:t>
+      </w:r>
+      <w:r>
+        <w:t xml:space="preserve"> </w:t>
+      </w:r>
+      <w:r>
+        <w:t xml:space="preserve">row, serialised per org with</w:t>
+      </w:r>
+      <w:r>
+        <w:t xml:space="preserve"> </w:t>
+      </w:r>
+      <w:r>
+        <w:rPr>
+          <w:rStyle w:val="VerbatimChar"/>
+        </w:rPr>
+        <w:t xml:space="preserve">SELECT … FOR UPDATE</w:t>
+      </w:r>
+      <w:r>
+        <w:t xml:space="preserve">. A failed debit is logged</w:t>
+      </w:r>
+      <w:r>
+        <w:t xml:space="preserve"> </w:t>
+      </w:r>
+      <w:r>
+        <w:t xml:space="preserve">and re-driven by the 5-minute cron reconciler.</w:t>
+      </w:r>
+      <w:r>
+        <w:t xml:space="preserve"> </w:t>
+      </w:r>
+      <w:r>
+        <w:t xml:space="preserve">- Grants: 100 credits at trial signup; the plan’s included credits issued at</w:t>
+      </w:r>
+      <w:r>
+        <w:t xml:space="preserve"> </w:t>
+      </w:r>
+      <w:r>
+        <w:t xml:space="preserve">every payment for that paid period (reset on the payment date); cron</w:t>
+      </w:r>
+      <w:r>
+        <w:t xml:space="preserve"> </w:t>
+      </w:r>
+      <w:r>
+        <w:t xml:space="preserve">back-fill for comped and Enterprise workspaces; founder grants and the</w:t>
+      </w:r>
+      <w:r>
+        <w:t xml:space="preserve"> </w:t>
+      </w:r>
+      <w:r>
+        <w:t xml:space="preserve">Enterprise per-period amount from the admin panel.</w:t>
+      </w:r>
+      <w:r>
+        <w:t xml:space="preserve"> </w:t>
+      </w:r>
+      <w:r>
+        <w:t xml:space="preserve">- At zero: the agent hands the conversation to a human with the usual</w:t>
+      </w:r>
+      <w:r>
+        <w:t xml:space="preserve"> </w:t>
+      </w:r>
+      <w:r>
+        <w:t xml:space="preserve">handoff line, reply drafts / summaries / campaign copy return a clear</w:t>
+      </w:r>
+      <w:r>
+        <w:t xml:space="preserve"> </w:t>
+      </w:r>
+      <w:r>
+        <w:t xml:space="preserve">message, a banner shows on Billing and the inbox, and the owner is emailed</w:t>
+      </w:r>
+      <w:r>
+        <w:t xml:space="preserve"> </w:t>
+      </w:r>
+      <w:r>
+        <w:t xml:space="preserve">once per period at 10% and at zero. Inbox, campaigns, follow-ups and voice</w:t>
+      </w:r>
+      <w:r>
+        <w:t xml:space="preserve"> </w:t>
+      </w:r>
+      <w:r>
+        <w:t xml:space="preserve">are never paused. BYOK is never metered. Knowledge setup is absorbed.</w:t>
+      </w:r>
+      <w:r>
+        <w:t xml:space="preserve"> </w:t>
+      </w:r>
+      <w:r>
+        <w:t xml:space="preserve">- Top-up packs (1,000 / 5,000 / 10,000; INR and SGD only) bought through the</w:t>
+      </w:r>
+      <w:r>
+        <w:t xml:space="preserve"> </w:t>
+      </w:r>
+      <w:r>
+        <w:t xml:space="preserve">existing Razorpay/Stripe flow, idempotent on the gateway payment id, expiring</w:t>
+      </w:r>
+      <w:r>
+        <w:t xml:space="preserve"> </w:t>
+      </w:r>
+      <w:r>
+        <w:t xml:space="preserve">after 365 days, never touching the plan.</w:t>
+      </w:r>
+      <w:r>
+        <w:t xml:space="preserve"> </w:t>
+      </w:r>
+      <w:r>
+        <w:t xml:space="preserve">-</w:t>
+      </w:r>
+      <w:r>
+        <w:t xml:space="preserve"> </w:t>
+      </w:r>
+      <w:r>
+        <w:rPr>
+          <w:rStyle w:val="VerbatimChar"/>
+        </w:rPr>
+        <w:t xml:space="preserve">SEND_MODE=simulation</w:t>
+      </w:r>
+      <w:r>
+        <w:t xml:space="preserve"> </w:t>
+      </w:r>
+      <w:r>
+        <w:t xml:space="preserve">records shadow debits and never blocks, so the whole</w:t>
+      </w:r>
+      <w:r>
+        <w:t xml:space="preserve"> </w:t>
+      </w:r>
+      <w:r>
+        <w:t xml:space="preserve">product still demos with zero keys.</w:t>
+      </w:r>
+    </w:p>
+    <w:p>
+      <w:pPr>
+        <w:pStyle w:val="BodyText"/>
+      </w:pPr>
+      <w:r>
+        <w:t xml:space="preserve">To go live it needs, in this order:</w:t>
+      </w:r>
+      <w:r>
+        <w:t xml:space="preserve"> </w:t>
+      </w:r>
+      <w:r>
+        <w:rPr>
+          <w:rStyle w:val="VerbatimChar"/>
+        </w:rPr>
+        <w:t xml:space="preserve">npm run db:push</w:t>
+      </w:r>
+      <w:r>
+        <w:t xml:space="preserve"> </w:t>
+      </w:r>
+      <w:r>
+        <w:t xml:space="preserve">then</w:t>
+      </w:r>
+      <w:r>
+        <w:t xml:space="preserve"> </w:t>
+      </w:r>
+      <w:r>
+        <w:rPr>
+          <w:rStyle w:val="VerbatimChar"/>
+        </w:rPr>
+        <w:t xml:space="preserve">npm run db:rls</w:t>
+      </w:r>
+      <w:r>
+        <w:t xml:space="preserve"> </w:t>
+      </w:r>
+      <w:r>
+        <w:t xml:space="preserve">against the production database (two defaulted columns on</w:t>
+      </w:r>
+      <w:r>
+        <w:t xml:space="preserve"> </w:t>
+      </w:r>
+      <w:r>
+        <w:rPr>
+          <w:rStyle w:val="VerbatimChar"/>
+        </w:rPr>
+        <w:t xml:space="preserve">AiUsage</w:t>
+      </w:r>
+      <w:r>
+        <w:t xml:space="preserve">, two new</w:t>
+      </w:r>
+      <w:r>
+        <w:t xml:space="preserve"> </w:t>
+      </w:r>
+      <w:r>
+        <w:t xml:space="preserve">tables, two nullable columns on</w:t>
+      </w:r>
+      <w:r>
+        <w:t xml:space="preserve"> </w:t>
+      </w:r>
+      <w:r>
+        <w:rPr>
+          <w:rStyle w:val="VerbatimChar"/>
+        </w:rPr>
+        <w:t xml:space="preserve">Org</w:t>
+      </w:r>
+      <w:r>
+        <w:t xml:space="preserve">), then a deploy.</w:t>
+      </w:r>
+      <w:r>
+        <w:t xml:space="preserve"> </w:t>
+      </w:r>
+      <w:r>
+        <w:rPr>
+          <w:b/>
+          <w:bCs/>
+        </w:rPr>
+        <w:t xml:space="preserve">Deploying before the</w:t>
+      </w:r>
+      <w:r>
+        <w:rPr>
+          <w:b/>
+          <w:bCs/>
+        </w:rPr>
+        <w:t xml:space="preserve"> </w:t>
+      </w:r>
+      <w:r>
+        <w:rPr>
+          <w:b/>
+          <w:bCs/>
+        </w:rPr>
+        <w:t xml:space="preserve">push breaks signup, checkout and every AI reply</w:t>
+      </w:r>
+      <w:r>
+        <w:t xml:space="preserve"> </w:t>
+      </w:r>
+      <w:r>
+        <w:t xml:space="preserve">— they read the new tables.</w:t>
+      </w:r>
+    </w:p>
+    <w:p>
+      <w:pPr>
+        <w:pStyle w:val="BodyText"/>
+      </w:pPr>
+      <w:r>
+        <w:t xml:space="preserve">Still not built:</w:t>
+      </w:r>
+      <w:r>
+        <w:t xml:space="preserve"> </w:t>
+      </w:r>
+      <w:r>
+        <w:t xml:space="preserve">- Auto-recharge, spending limits, refunds of credits.</w:t>
+      </w:r>
+      <w:r>
+        <w:t xml:space="preserve"> </w:t>
+      </w:r>
+      <w:r>
+        <w:t xml:space="preserve">- Annual checkout (the public</w:t>
+      </w:r>
+      <w:r>
+        <w:t xml:space="preserve"> </w:t>
+      </w:r>
+      <w:r>
+        <w:t xml:space="preserve">“yearly”</w:t>
+      </w:r>
+      <w:r>
+        <w:t xml:space="preserve"> </w:t>
+      </w:r>
+      <w:r>
+        <w:t xml:space="preserve">toggle is display-only).</w:t>
       </w:r>
       <w:r>
         <w:t xml:space="preserve"> </w:t>
       </w:r>
       <w:r>
         <w:t xml:space="preserve">- Real Meta spend on the dashboard.</w:t>
+      </w:r>
+      <w:r>
+        <w:t xml:space="preserve"> </w:t>
+      </w:r>
+      <w:r>
+        <w:t xml:space="preserve">- The concurrency integration test against a real Postgres (task 9; the unit</w:t>
+      </w:r>
+      <w:r>
+        <w:t xml:space="preserve"> </w:t>
+      </w:r>
+      <w:r>
+        <w:t xml:space="preserve">tests cover the logic, the lock is exercised only with</w:t>
+      </w:r>
+      <w:r>
+        <w:t xml:space="preserve"> </w:t>
+      </w:r>
+      <w:r>
+        <w:rPr>
+          <w:rStyle w:val="VerbatimChar"/>
+        </w:rPr>
+        <w:t xml:space="preserve">TEST_DATABASE_URL</w:t>
+      </w:r>
+      <w:r>
+        <w:t xml:space="preserve">).</w:t>
       </w:r>
     </w:p>
     <w:p>
@@ -4134,13 +4459,13 @@
         <w:t xml:space="preserve"> </w:t>
       </w:r>
       <w:r>
-        <w:t xml:space="preserve">logs AI usage asynchronously with approximate</w:t>
-      </w:r>
-      <w:r>
-        <w:t xml:space="preserve"> </w:t>
-      </w:r>
-      <w:r>
-        <w:t xml:space="preserve">model-family prices and swallows write failures. It prices anything named</w:t>
+        <w:t xml:space="preserve">remains analytics only: it still prices</w:t>
+      </w:r>
+      <w:r>
+        <w:t xml:space="preserve"> </w:t>
+      </w:r>
+      <w:r>
+        <w:t xml:space="preserve">anything named</w:t>
       </w:r>
       <w:r>
         <w:t xml:space="preserve"> </w:t>
@@ -4152,7 +4477,7 @@
         <w:t xml:space="preserve"> </w:t>
       </w:r>
       <w:r>
-        <w:t xml:space="preserve">at US$3 / US$15, so the founder-side AI-cost analytics currently</w:t>
+        <w:t xml:space="preserve">at US$3 / US$15, so the founder-side AI-cost analytics</w:t>
       </w:r>
       <w:r>
         <w:t xml:space="preserve"> </w:t>
@@ -4165,69 +4490,13 @@
         <w:t xml:space="preserve">overstate Sonnet 5 cost by 50%</w:t>
       </w:r>
       <w:r>
-        <w:t xml:space="preserve"> </w:t>
-      </w:r>
-      <w:r>
-        <w:t xml:space="preserve">and ignore cache tokens. It is analytics,</w:t>
-      </w:r>
-      <w:r>
-        <w:t xml:space="preserve"> </w:t>
-      </w:r>
-      <w:r>
-        <w:t xml:space="preserve">not a ledger; customers must not be debited from it.</w:t>
-      </w:r>
-    </w:p>
-    <w:p>
-      <w:pPr>
-        <w:pStyle w:val="BodyText"/>
-      </w:pPr>
-      <w:r>
-        <w:t xml:space="preserve">The build that turns credits into a real balance is specified in</w:t>
-      </w:r>
-      <w:r>
-        <w:t xml:space="preserve"> </w:t>
-      </w:r>
-      <w:r>
-        <w:rPr>
-          <w:rStyle w:val="VerbatimChar"/>
-        </w:rPr>
-        <w:t xml:space="preserve">docs/superpowers/plans/2026-09-15-credit-ledger.md</w:t>
-      </w:r>
-      <w:r>
-        <w:t xml:space="preserve"> </w:t>
-      </w:r>
-      <w:r>
-        <w:t xml:space="preserve">(≈35 hours, nine</w:t>
-      </w:r>
-      <w:r>
-        <w:t xml:space="preserve"> </w:t>
-      </w:r>
-      <w:r>
-        <w:t xml:space="preserve">independently shippable tasks): an exact-model rate card, an org-scoped grant</w:t>
-      </w:r>
-      <w:r>
-        <w:t xml:space="preserve"> </w:t>
-      </w:r>
-      <w:r>
-        <w:t xml:space="preserve">and debit ledger debited at the model-router doorway, calendar-month resets,</w:t>
-      </w:r>
-      <w:r>
-        <w:t xml:space="preserve"> </w:t>
-      </w:r>
-      <w:r>
-        <w:t xml:space="preserve">top-up purchase through the existing Razorpay/Stripe flow, founder grants,</w:t>
-      </w:r>
-      <w:r>
-        <w:t xml:space="preserve"> </w:t>
-      </w:r>
-      <w:r>
-        <w:t xml:space="preserve">and a balance on Settings → Billing. It carries six founder decisions that</w:t>
-      </w:r>
-      <w:r>
-        <w:t xml:space="preserve"> </w:t>
-      </w:r>
-      <w:r>
-        <w:t xml:space="preserve">must be answered before it ships.</w:t>
+        <w:t xml:space="preserve">. Customers are debited from the rate card,</w:t>
+      </w:r>
+      <w:r>
+        <w:t xml:space="preserve"> </w:t>
+      </w:r>
+      <w:r>
+        <w:t xml:space="preserve">never from it.</w:t>
       </w:r>
     </w:p>
     <w:bookmarkEnd w:id="31"/>
@@ -4276,7 +4545,73 @@
         </w:numPr>
       </w:pPr>
       <w:r>
-        <w:t xml:space="preserve">Build the credit ledger (§7) with tests; exclude simulation from real charges.</w:t>
+        <w:t xml:space="preserve">Push the ledger schema (</w:t>
+      </w:r>
+      <w:r>
+        <w:rPr>
+          <w:rStyle w:val="VerbatimChar"/>
+        </w:rPr>
+        <w:t xml:space="preserve">db:push</w:t>
+      </w:r>
+      <w:r>
+        <w:t xml:space="preserve"> </w:t>
+      </w:r>
+      <w:r>
+        <w:t xml:space="preserve">→</w:t>
+      </w:r>
+      <w:r>
+        <w:t xml:space="preserve"> </w:t>
+      </w:r>
+      <w:r>
+        <w:rPr>
+          <w:rStyle w:val="VerbatimChar"/>
+        </w:rPr>
+        <w:t xml:space="preserve">db:rls</w:t>
+      </w:r>
+      <w:r>
+        <w:t xml:space="preserve">), deploy, and watch the cron</w:t>
+      </w:r>
+      <w:r>
+        <w:t xml:space="preserve"> </w:t>
+      </w:r>
+      <w:r>
+        <w:t xml:space="preserve">heartbeat’s</w:t>
+      </w:r>
+      <w:r>
+        <w:t xml:space="preserve"> </w:t>
+      </w:r>
+      <w:r>
+        <w:rPr>
+          <w:rStyle w:val="VerbatimChar"/>
+        </w:rPr>
+        <w:t xml:space="preserve">creditDebits.failed</w:t>
+      </w:r>
+      <w:r>
+        <w:t xml:space="preserve"> </w:t>
+      </w:r>
+      <w:r>
+        <w:t xml:space="preserve">count and the</w:t>
+      </w:r>
+      <w:r>
+        <w:t xml:space="preserve"> </w:t>
+      </w:r>
+      <w:r>
+        <w:rPr>
+          <w:rStyle w:val="VerbatimChar"/>
+        </w:rPr>
+        <w:t xml:space="preserve">[credits]</w:t>
+      </w:r>
+      <w:r>
+        <w:t xml:space="preserve"> </w:t>
+      </w:r>
+      <w:r>
+        <w:t xml:space="preserve">logs for the</w:t>
+      </w:r>
+      <w:r>
+        <w:t xml:space="preserve"> </w:t>
+      </w:r>
+      <w:r>
+        <w:t xml:space="preserve">first week; the ledger itself is built and tested (§7).</w:t>
       </w:r>
     </w:p>
     <w:p>

</xml_diff>